<commit_message>
Fill zone deleted. Duddy fix it please
</commit_message>
<xml_diff>
--- a/docs/SDC.docx
+++ b/docs/SDC.docx
@@ -284,7 +284,7 @@
                 <w:rFonts w:eastAsia="Aptos" w:cs="Times New Roman"/>
                 <w:lang w:val="sr-Latn-RS" w:eastAsia="en-US" w:bidi="ar-SA"/>
               </w:rPr>
-              <w:instrText xml:space="preserve"> XE "(naziv podtima): : : : : " </w:instrText>
+              <w:instrText xml:space="preserve"> XE "(naziv podtima): : : : : : " </w:instrText>
             </w:r>
             <w:r>
               <w:rPr>
@@ -436,8 +436,8 @@
         <w:tblLook w:val="04a0" w:noHBand="0" w:noVBand="1" w:firstColumn="1" w:lastRow="0" w:lastColumn="0" w:firstRow="1"/>
       </w:tblPr>
       <w:tblGrid>
-        <w:gridCol w:w="2150"/>
-        <w:gridCol w:w="8305"/>
+        <w:gridCol w:w="2149"/>
+        <w:gridCol w:w="8306"/>
       </w:tblGrid>
       <w:tr>
         <w:trPr>
@@ -484,7 +484,7 @@
         </w:trPr>
         <w:tc>
           <w:tcPr>
-            <w:tcW w:w="2150" w:type="dxa"/>
+            <w:tcW w:w="2149" w:type="dxa"/>
             <w:tcBorders/>
           </w:tcPr>
           <w:p>
@@ -528,7 +528,7 @@
         </w:tc>
         <w:tc>
           <w:tcPr>
-            <w:tcW w:w="8305" w:type="dxa"/>
+            <w:tcW w:w="8306" w:type="dxa"/>
             <w:tcBorders/>
           </w:tcPr>
           <w:p>
@@ -561,7 +561,7 @@
         </w:trPr>
         <w:tc>
           <w:tcPr>
-            <w:tcW w:w="2150" w:type="dxa"/>
+            <w:tcW w:w="2149" w:type="dxa"/>
             <w:tcBorders/>
           </w:tcPr>
           <w:p>
@@ -605,7 +605,7 @@
         </w:tc>
         <w:tc>
           <w:tcPr>
-            <w:tcW w:w="8305" w:type="dxa"/>
+            <w:tcW w:w="8306" w:type="dxa"/>
             <w:tcBorders/>
           </w:tcPr>
           <w:p>
@@ -628,67 +628,7 @@
                 <w:szCs w:val="24"/>
                 <w:lang w:val="sr-Latn-RS" w:eastAsia="en-US" w:bidi="ar-SA"/>
               </w:rPr>
-              <w:t xml:space="preserve">Implementiran je serijski shutdown sistem koji obuhvata LVMS, TSMS, tri ručna shutdown prekidača, BOTS, inercioni prekidač, BSPD, IMD, AMS, TSAL i sve neophodne interlock linije. Svaka komponenta može samostalno otvoriti SDC u slučaju nebezbednog stanja. Logika lečovanja AMS, </w:t>
-            </w:r>
-            <w:r>
-              <w:rPr>
-                <w:rFonts w:eastAsia="Aptos" w:cs="Times New Roman"/>
-                <w:kern w:val="2"/>
-                <w:sz w:val="24"/>
-                <w:szCs w:val="24"/>
-                <w:lang w:val="sr-Latn-RS" w:eastAsia="en-US" w:bidi="ar-SA"/>
-              </w:rPr>
-              <w:t>BSPD i</w:t>
-            </w:r>
-            <w:r>
-              <w:rPr>
-                <w:rFonts w:eastAsia="Aptos" w:cs="Times New Roman"/>
-                <w:kern w:val="2"/>
-                <w:sz w:val="24"/>
-                <w:szCs w:val="24"/>
-                <w:lang w:val="sr-Latn-RS" w:eastAsia="en-US" w:bidi="ar-SA"/>
-              </w:rPr>
-              <w:t xml:space="preserve"> IMD signala koristi </w:t>
-            </w:r>
-            <w:r>
-              <w:rPr>
-                <w:rFonts w:eastAsia="Aptos" w:cs="Times New Roman"/>
-                <w:kern w:val="2"/>
-                <w:sz w:val="24"/>
-                <w:szCs w:val="24"/>
-                <w:lang w:val="sr-Latn-RS" w:eastAsia="en-US" w:bidi="ar-SA"/>
-              </w:rPr>
-              <w:t xml:space="preserve">AND i </w:t>
-            </w:r>
-            <w:r>
-              <w:rPr>
-                <w:rFonts w:eastAsia="Aptos" w:cs="Times New Roman"/>
-                <w:kern w:val="2"/>
-                <w:sz w:val="24"/>
-                <w:szCs w:val="24"/>
-                <w:lang w:val="sr-Latn-RS" w:eastAsia="en-US" w:bidi="ar-SA"/>
-              </w:rPr>
-              <w:t>NAND čip</w:t>
-            </w:r>
-            <w:r>
-              <w:rPr>
-                <w:rFonts w:eastAsia="Aptos" w:cs="Times New Roman"/>
-                <w:kern w:val="2"/>
-                <w:sz w:val="24"/>
-                <w:szCs w:val="24"/>
-                <w:lang w:val="sr-Latn-RS" w:eastAsia="en-US" w:bidi="ar-SA"/>
-              </w:rPr>
-              <w:t>ove</w:t>
-            </w:r>
-            <w:r>
-              <w:rPr>
-                <w:rFonts w:eastAsia="Aptos" w:cs="Times New Roman"/>
-                <w:kern w:val="2"/>
-                <w:sz w:val="24"/>
-                <w:szCs w:val="24"/>
-                <w:lang w:val="sr-Latn-RS" w:eastAsia="en-US" w:bidi="ar-SA"/>
-              </w:rPr>
-              <w:t xml:space="preserve"> i flip-flop, dok TSAL otvara kolo u slučaju mehaničke greške na AIR-u.</w:t>
+              <w:t>Implementiran je serijski shutdown sistem koji obuhvata LVMS, TSMS, tri ručna shutdown prekidača, BOTS, inercioni prekidač, BSPD, IMD, AMS, TSAL i sve neophodne interlock linije. Svaka komponenta može samostalno otvoriti SDC u slučaju nebezbednog stanja. Logika lečovanja AMS, BSPD i IMD signala koristi AND i NAND čipove i flip-flop, dok TSAL otvara kolo u slučaju mehaničke greške na AIR-u.</w:t>
             </w:r>
           </w:p>
         </w:tc>
@@ -699,7 +639,7 @@
         </w:trPr>
         <w:tc>
           <w:tcPr>
-            <w:tcW w:w="2150" w:type="dxa"/>
+            <w:tcW w:w="2149" w:type="dxa"/>
             <w:tcBorders/>
           </w:tcPr>
           <w:p>
@@ -743,7 +683,7 @@
         </w:tc>
         <w:tc>
           <w:tcPr>
-            <w:tcW w:w="8305" w:type="dxa"/>
+            <w:tcW w:w="8306" w:type="dxa"/>
             <w:tcBorders/>
           </w:tcPr>
           <w:p>
@@ -776,7 +716,7 @@
         </w:trPr>
         <w:tc>
           <w:tcPr>
-            <w:tcW w:w="2150" w:type="dxa"/>
+            <w:tcW w:w="2149" w:type="dxa"/>
             <w:tcBorders/>
           </w:tcPr>
           <w:p>
@@ -821,7 +761,7 @@
         </w:tc>
         <w:tc>
           <w:tcPr>
-            <w:tcW w:w="8305" w:type="dxa"/>
+            <w:tcW w:w="8306" w:type="dxa"/>
             <w:tcBorders/>
           </w:tcPr>
           <w:p>
@@ -855,7 +795,7 @@
         </w:trPr>
         <w:tc>
           <w:tcPr>
-            <w:tcW w:w="2150" w:type="dxa"/>
+            <w:tcW w:w="2149" w:type="dxa"/>
             <w:tcBorders/>
           </w:tcPr>
           <w:p>
@@ -900,7 +840,7 @@
         </w:tc>
         <w:tc>
           <w:tcPr>
-            <w:tcW w:w="8305" w:type="dxa"/>
+            <w:tcW w:w="8306" w:type="dxa"/>
             <w:tcBorders/>
           </w:tcPr>
           <w:p>
@@ -923,37 +863,7 @@
                 <w:szCs w:val="24"/>
                 <w:lang w:val="sr-Latn-RS" w:eastAsia="en-US" w:bidi="ar-SA"/>
               </w:rPr>
-              <w:t>6</w:t>
-            </w:r>
-            <w:r>
-              <w:rPr>
-                <w:rFonts w:eastAsia="Aptos" w:cs="Times New Roman"/>
-                <w:kern w:val="2"/>
-                <w:sz w:val="24"/>
-                <w:szCs w:val="24"/>
-                <w:lang w:val="sr-Latn-RS" w:eastAsia="en-US" w:bidi="ar-SA"/>
-              </w:rPr>
-              <w:t>.</w:t>
-            </w:r>
-            <w:r>
-              <w:rPr>
-                <w:rFonts w:eastAsia="Aptos" w:cs="Times New Roman"/>
-                <w:kern w:val="2"/>
-                <w:sz w:val="24"/>
-                <w:szCs w:val="24"/>
-                <w:lang w:val="sr-Latn-RS" w:eastAsia="en-US" w:bidi="ar-SA"/>
-              </w:rPr>
-              <w:t>5</w:t>
-            </w:r>
-            <w:r>
-              <w:rPr>
-                <w:rFonts w:eastAsia="Aptos" w:cs="Times New Roman"/>
-                <w:kern w:val="2"/>
-                <w:sz w:val="24"/>
-                <w:szCs w:val="24"/>
-                <w:lang w:val="sr-Latn-RS" w:eastAsia="en-US" w:bidi="ar-SA"/>
-              </w:rPr>
-              <w:t>.2026.</w:t>
+              <w:t>6.5.2026.</w:t>
             </w:r>
           </w:p>
         </w:tc>
@@ -964,7 +874,7 @@
         </w:trPr>
         <w:tc>
           <w:tcPr>
-            <w:tcW w:w="2150" w:type="dxa"/>
+            <w:tcW w:w="2149" w:type="dxa"/>
             <w:tcBorders/>
           </w:tcPr>
           <w:p>
@@ -1009,7 +919,7 @@
         </w:tc>
         <w:tc>
           <w:tcPr>
-            <w:tcW w:w="8305" w:type="dxa"/>
+            <w:tcW w:w="8306" w:type="dxa"/>
             <w:tcBorders/>
           </w:tcPr>
           <w:p>
@@ -1327,9 +1237,12 @@
         </w:rPr>
       </w:pPr>
       <w:r>
-        <w:rPr/>
+        <w:rPr>
+          <w:rFonts w:cs="Times New Roman"/>
+          <w:lang w:val="sr-Latn-RS"/>
+        </w:rPr>
         <w:drawing>
-          <wp:anchor behindDoc="0" distT="0" distB="0" distL="0" distR="0" simplePos="0" locked="0" layoutInCell="0" allowOverlap="1" relativeHeight="67">
+          <wp:anchor behindDoc="0" distT="0" distB="0" distL="0" distR="0" simplePos="0" locked="0" layoutInCell="0" allowOverlap="1" relativeHeight="53">
             <wp:simplePos x="0" y="0"/>
             <wp:positionH relativeFrom="column">
               <wp:align>center</wp:align>
@@ -1469,14 +1382,14 @@
         <w:tblLook w:val="04a0" w:noHBand="0" w:noVBand="1" w:firstColumn="1" w:lastRow="0" w:lastColumn="0" w:firstRow="1"/>
       </w:tblPr>
       <w:tblGrid>
-        <w:gridCol w:w="1691"/>
-        <w:gridCol w:w="8764"/>
+        <w:gridCol w:w="1690"/>
+        <w:gridCol w:w="8765"/>
       </w:tblGrid>
       <w:tr>
         <w:trPr/>
         <w:tc>
           <w:tcPr>
-            <w:tcW w:w="1691" w:type="dxa"/>
+            <w:tcW w:w="1690" w:type="dxa"/>
             <w:tcBorders/>
           </w:tcPr>
           <w:p>
@@ -1532,7 +1445,7 @@
         </w:tc>
         <w:tc>
           <w:tcPr>
-            <w:tcW w:w="8764" w:type="dxa"/>
+            <w:tcW w:w="8765" w:type="dxa"/>
             <w:tcBorders/>
           </w:tcPr>
           <w:p>
@@ -1565,7 +1478,7 @@
         </w:trPr>
         <w:tc>
           <w:tcPr>
-            <w:tcW w:w="1691" w:type="dxa"/>
+            <w:tcW w:w="1690" w:type="dxa"/>
             <w:tcBorders/>
           </w:tcPr>
           <w:p>
@@ -1598,7 +1511,7 @@
         </w:tc>
         <w:tc>
           <w:tcPr>
-            <w:tcW w:w="8764" w:type="dxa"/>
+            <w:tcW w:w="8765" w:type="dxa"/>
             <w:tcBorders/>
           </w:tcPr>
           <w:p>
@@ -1629,7 +1542,7 @@
         <w:trPr/>
         <w:tc>
           <w:tcPr>
-            <w:tcW w:w="1691" w:type="dxa"/>
+            <w:tcW w:w="1690" w:type="dxa"/>
             <w:tcBorders/>
           </w:tcPr>
           <w:p>
@@ -1662,7 +1575,7 @@
         </w:tc>
         <w:tc>
           <w:tcPr>
-            <w:tcW w:w="8764" w:type="dxa"/>
+            <w:tcW w:w="8765" w:type="dxa"/>
             <w:tcBorders/>
           </w:tcPr>
           <w:p>
@@ -1693,7 +1606,7 @@
         <w:trPr/>
         <w:tc>
           <w:tcPr>
-            <w:tcW w:w="1691" w:type="dxa"/>
+            <w:tcW w:w="1690" w:type="dxa"/>
             <w:tcBorders/>
           </w:tcPr>
           <w:p>
@@ -1749,7 +1662,7 @@
         </w:tc>
         <w:tc>
           <w:tcPr>
-            <w:tcW w:w="8764" w:type="dxa"/>
+            <w:tcW w:w="8765" w:type="dxa"/>
             <w:tcBorders/>
           </w:tcPr>
           <w:p>
@@ -1780,7 +1693,7 @@
         <w:trPr/>
         <w:tc>
           <w:tcPr>
-            <w:tcW w:w="1691" w:type="dxa"/>
+            <w:tcW w:w="1690" w:type="dxa"/>
             <w:tcBorders/>
           </w:tcPr>
           <w:p>
@@ -1836,7 +1749,7 @@
         </w:tc>
         <w:tc>
           <w:tcPr>
-            <w:tcW w:w="8764" w:type="dxa"/>
+            <w:tcW w:w="8765" w:type="dxa"/>
             <w:tcBorders/>
           </w:tcPr>
           <w:p>
@@ -1867,7 +1780,7 @@
         <w:trPr/>
         <w:tc>
           <w:tcPr>
-            <w:tcW w:w="1691" w:type="dxa"/>
+            <w:tcW w:w="1690" w:type="dxa"/>
             <w:tcBorders/>
           </w:tcPr>
           <w:p>
@@ -1898,7 +1811,7 @@
         </w:tc>
         <w:tc>
           <w:tcPr>
-            <w:tcW w:w="8764" w:type="dxa"/>
+            <w:tcW w:w="8765" w:type="dxa"/>
             <w:tcBorders/>
           </w:tcPr>
           <w:p>
@@ -1929,7 +1842,7 @@
         <w:trPr/>
         <w:tc>
           <w:tcPr>
-            <w:tcW w:w="1691" w:type="dxa"/>
+            <w:tcW w:w="1690" w:type="dxa"/>
             <w:tcBorders/>
           </w:tcPr>
           <w:p>
@@ -1962,7 +1875,7 @@
         </w:tc>
         <w:tc>
           <w:tcPr>
-            <w:tcW w:w="8764" w:type="dxa"/>
+            <w:tcW w:w="8765" w:type="dxa"/>
             <w:tcBorders/>
           </w:tcPr>
           <w:p>
@@ -1993,7 +1906,7 @@
         <w:trPr/>
         <w:tc>
           <w:tcPr>
-            <w:tcW w:w="1691" w:type="dxa"/>
+            <w:tcW w:w="1690" w:type="dxa"/>
             <w:tcBorders/>
           </w:tcPr>
           <w:p>
@@ -2049,7 +1962,7 @@
         </w:tc>
         <w:tc>
           <w:tcPr>
-            <w:tcW w:w="8764" w:type="dxa"/>
+            <w:tcW w:w="8765" w:type="dxa"/>
             <w:tcBorders/>
           </w:tcPr>
           <w:p>
@@ -2080,7 +1993,7 @@
         <w:trPr/>
         <w:tc>
           <w:tcPr>
-            <w:tcW w:w="1691" w:type="dxa"/>
+            <w:tcW w:w="1690" w:type="dxa"/>
             <w:tcBorders/>
           </w:tcPr>
           <w:p>
@@ -2113,7 +2026,7 @@
         </w:tc>
         <w:tc>
           <w:tcPr>
-            <w:tcW w:w="8764" w:type="dxa"/>
+            <w:tcW w:w="8765" w:type="dxa"/>
             <w:tcBorders/>
           </w:tcPr>
           <w:p>
@@ -2144,7 +2057,7 @@
         <w:trPr/>
         <w:tc>
           <w:tcPr>
-            <w:tcW w:w="1691" w:type="dxa"/>
+            <w:tcW w:w="1690" w:type="dxa"/>
             <w:tcBorders/>
           </w:tcPr>
           <w:p>
@@ -2200,7 +2113,7 @@
         </w:tc>
         <w:tc>
           <w:tcPr>
-            <w:tcW w:w="8764" w:type="dxa"/>
+            <w:tcW w:w="8765" w:type="dxa"/>
             <w:tcBorders/>
           </w:tcPr>
           <w:p>
@@ -2231,7 +2144,7 @@
         <w:trPr/>
         <w:tc>
           <w:tcPr>
-            <w:tcW w:w="1691" w:type="dxa"/>
+            <w:tcW w:w="1690" w:type="dxa"/>
             <w:tcBorders/>
           </w:tcPr>
           <w:p>
@@ -2308,7 +2221,7 @@
         </w:tc>
         <w:tc>
           <w:tcPr>
-            <w:tcW w:w="8764" w:type="dxa"/>
+            <w:tcW w:w="8765" w:type="dxa"/>
             <w:tcBorders/>
           </w:tcPr>
           <w:p>
@@ -2339,7 +2252,7 @@
         <w:trPr/>
         <w:tc>
           <w:tcPr>
-            <w:tcW w:w="1691" w:type="dxa"/>
+            <w:tcW w:w="1690" w:type="dxa"/>
             <w:tcBorders/>
           </w:tcPr>
           <w:p>
@@ -2393,7 +2306,7 @@
         </w:tc>
         <w:tc>
           <w:tcPr>
-            <w:tcW w:w="8764" w:type="dxa"/>
+            <w:tcW w:w="8765" w:type="dxa"/>
             <w:tcBorders/>
           </w:tcPr>
           <w:p>
@@ -2425,7 +2338,7 @@
         <w:trPr/>
         <w:tc>
           <w:tcPr>
-            <w:tcW w:w="1691" w:type="dxa"/>
+            <w:tcW w:w="1690" w:type="dxa"/>
             <w:tcBorders/>
           </w:tcPr>
           <w:p>
@@ -2480,7 +2393,7 @@
         </w:tc>
         <w:tc>
           <w:tcPr>
-            <w:tcW w:w="8764" w:type="dxa"/>
+            <w:tcW w:w="8765" w:type="dxa"/>
             <w:tcBorders/>
           </w:tcPr>
           <w:p>
@@ -2514,7 +2427,7 @@
         </w:trPr>
         <w:tc>
           <w:tcPr>
-            <w:tcW w:w="1691" w:type="dxa"/>
+            <w:tcW w:w="1690" w:type="dxa"/>
             <w:tcBorders/>
           </w:tcPr>
           <w:p>
@@ -2547,7 +2460,7 @@
         </w:tc>
         <w:tc>
           <w:tcPr>
-            <w:tcW w:w="8764" w:type="dxa"/>
+            <w:tcW w:w="8765" w:type="dxa"/>
             <w:tcBorders/>
           </w:tcPr>
           <w:p>
@@ -6346,10 +6259,7 @@
         </w:rPr>
       </w:pPr>
       <w:r>
-        <w:rPr>
-          <w:color w:val="C9211E"/>
-        </w:rPr>
-        <w:t>Slika 3.1 SDC</w:t>
+        <w:rPr/>
       </w:r>
     </w:p>
     <w:p>
@@ -6495,7 +6405,7 @@
       </w:pPr>
       <w:r>
         <w:drawing>
-          <wp:anchor behindDoc="0" distT="0" distB="0" distL="0" distR="0" simplePos="0" locked="0" layoutInCell="0" allowOverlap="1" relativeHeight="69">
+          <wp:anchor behindDoc="0" distT="0" distB="0" distL="0" distR="0" simplePos="0" locked="0" layoutInCell="0" allowOverlap="1" relativeHeight="55">
             <wp:simplePos x="0" y="0"/>
             <wp:positionH relativeFrom="column">
               <wp:align>center</wp:align>
@@ -6547,43 +6457,7 @@
           <w:color w:val="000000"/>
           <w:lang w:val="sr-Latn-RS"/>
         </w:rPr>
-        <w:t>3.2</w:t>
-      </w:r>
-      <w:r>
-        <w:rPr>
-          <w:b w:val="false"/>
-          <w:bCs w:val="false"/>
-          <w:color w:val="000000"/>
-          <w:lang w:val="sr-Latn-RS"/>
-        </w:rPr>
-        <w:t>a</w:t>
-      </w:r>
-      <w:r>
-        <w:rPr>
-          <w:b w:val="false"/>
-          <w:bCs w:val="false"/>
-          <w:color w:val="000000"/>
-          <w:lang w:val="sr-Latn-RS"/>
-        </w:rPr>
-        <w:t xml:space="preserve"> </w:t>
-      </w:r>
-      <w:r>
-        <w:rPr>
-          <w:b w:val="false"/>
-          <w:bCs w:val="false"/>
-          <w:color w:val="000000"/>
-          <w:lang w:val="sr-Latn-RS"/>
-        </w:rPr>
-        <w:t>Šematik</w:t>
-      </w:r>
-      <w:r>
-        <w:rPr>
-          <w:b w:val="false"/>
-          <w:bCs w:val="false"/>
-          <w:color w:val="000000"/>
-          <w:lang w:val="sr-Latn-RS"/>
-        </w:rPr>
-        <w:t xml:space="preserve"> SDC kontrolne pločice (Shutdown Circuit Board)</w:t>
+        <w:t>3.2a Šematik SDC kontrolne pločice (Shutdown Circuit Board)</w:t>
       </w:r>
     </w:p>
     <w:p>
@@ -6605,7 +6479,7 @@
       <w:r>
         <w:rPr/>
         <w:drawing>
-          <wp:anchor behindDoc="0" distT="0" distB="0" distL="0" distR="0" simplePos="0" locked="0" layoutInCell="0" allowOverlap="1" relativeHeight="75">
+          <wp:anchor behindDoc="0" distT="0" distB="0" distL="0" distR="0" simplePos="0" locked="0" layoutInCell="0" allowOverlap="1" relativeHeight="66">
             <wp:simplePos x="0" y="0"/>
             <wp:positionH relativeFrom="column">
               <wp:align>center</wp:align>
@@ -6887,34 +6761,7 @@
           <w:color w:val="000000"/>
           <w:lang w:val="sr-Latn-RS"/>
         </w:rPr>
-        <w:t>3.2</w:t>
-      </w:r>
-      <w:r>
-        <w:rPr>
-          <w:b w:val="false"/>
-          <w:bCs w:val="false"/>
-          <w:color w:val="000000"/>
-          <w:lang w:val="sr-Latn-RS"/>
-        </w:rPr>
-        <w:t>b</w:t>
-      </w:r>
-      <w:r>
-        <w:rPr>
-          <w:b w:val="false"/>
-          <w:bCs w:val="false"/>
-          <w:color w:val="000000"/>
-          <w:lang w:val="sr-Latn-RS"/>
-        </w:rPr>
-        <w:t xml:space="preserve"> </w:t>
-      </w:r>
-      <w:r>
-        <w:rPr>
-          <w:b w:val="false"/>
-          <w:bCs w:val="false"/>
-          <w:color w:val="000000"/>
-          <w:lang w:val="sr-Latn-RS"/>
-        </w:rPr>
-        <w:t>Layout SDC pločice (dvoslojni)</w:t>
+        <w:t>3.2b Layout SDC pločice (dvoslojni)</w:t>
       </w:r>
     </w:p>
     <w:p>
@@ -6927,7 +6774,7 @@
       </w:pPr>
       <w:r>
         <w:drawing>
-          <wp:anchor behindDoc="0" distT="0" distB="0" distL="0" distR="0" simplePos="0" locked="0" layoutInCell="0" allowOverlap="1" relativeHeight="76">
+          <wp:anchor behindDoc="0" distT="0" distB="0" distL="0" distR="0" simplePos="0" locked="0" layoutInCell="0" allowOverlap="1" relativeHeight="67">
             <wp:simplePos x="0" y="0"/>
             <wp:positionH relativeFrom="column">
               <wp:align>center</wp:align>
@@ -7022,28 +6869,14 @@
           <w:i/>
           <w:iCs/>
         </w:rPr>
-        <w:t xml:space="preserve"> </w:t>
-      </w:r>
-      <w:r>
-        <w:rPr>
-          <w:i/>
-          <w:iCs/>
-        </w:rPr>
-        <w:t>CD4081 AND</w:t>
+        <w:t xml:space="preserve"> CD4081 AND</w:t>
       </w:r>
       <w:r>
         <w:rPr>
           <w:i w:val="false"/>
           <w:iCs w:val="false"/>
         </w:rPr>
-        <w:t xml:space="preserve"> kapije,</w:t>
-      </w:r>
-      <w:r>
-        <w:rPr>
-          <w:i w:val="false"/>
-          <w:iCs w:val="false"/>
-        </w:rPr>
-        <w:t xml:space="preserve"> </w:t>
+        <w:t xml:space="preserve"> kapije, </w:t>
       </w:r>
       <w:r>
         <w:rPr>
@@ -7053,15 +6886,7 @@
       </w:r>
       <w:r>
         <w:rPr/>
-        <w:t xml:space="preserve"> kapij</w:t>
-      </w:r>
-      <w:r>
-        <w:rPr/>
-        <w:t>e</w:t>
-      </w:r>
-      <w:r>
-        <w:rPr/>
-        <w:t xml:space="preserve"> sa Šmitovim okidačima i </w:t>
+        <w:t xml:space="preserve"> kapije sa Šmitovim okidačima i </w:t>
       </w:r>
       <w:r>
         <w:rPr>
@@ -7081,15 +6906,7 @@
       </w:r>
       <w:r>
         <w:rPr/>
-        <w:t xml:space="preserve">. Ovo omogućava da greške sa </w:t>
-      </w:r>
-      <w:r>
-        <w:rPr/>
-        <w:t xml:space="preserve">BSPD-a, </w:t>
-      </w:r>
-      <w:r>
-        <w:rPr/>
-        <w:t>AMS-a ili IMD-a trajno otvore SDC dok se ne izvrši ručni reset. Reset taster je namerno lociran van same pločice kako bi bio dostupan na eksterijeru vozila.</w:t>
+        <w:t>. Ovo omogućava da greške sa BSPD-a, AMS-a ili IMD-a trajno otvore SDC dok se ne izvrši ručni reset. Reset taster je namerno lociran van same pločice kako bi bio dostupan na eksterijeru vozila.</w:t>
       </w:r>
     </w:p>
     <w:p>
@@ -7124,15 +6941,7 @@
       </w:r>
       <w:r>
         <w:rPr/>
-        <w:t xml:space="preserve"> releja. Jedan je pod kontrolom lečovane logike (AMS/IMD/</w:t>
-      </w:r>
-      <w:r>
-        <w:rPr/>
-        <w:t>BSPD</w:t>
-      </w:r>
-      <w:r>
-        <w:rPr/>
-        <w:t xml:space="preserve">), dok je drugi direktno kontrolisan od strane TSAL signala greške. </w:t>
+        <w:t xml:space="preserve"> releja. Jedan je pod kontrolom lečovane logike (AMS/IMD/BSPD), dok je drugi direktno kontrolisan od strane TSAL signala greške. </w:t>
       </w:r>
     </w:p>
     <w:p>
@@ -8883,9 +8692,11 @@
         </w:rPr>
       </w:pPr>
       <w:r>
-        <w:rPr/>
+        <w:rPr>
+          <w:lang w:val="sr-Latn-RS"/>
+        </w:rPr>
         <w:drawing>
-          <wp:anchor behindDoc="0" distT="0" distB="0" distL="0" distR="0" simplePos="0" locked="0" layoutInCell="0" allowOverlap="1" relativeHeight="70">
+          <wp:anchor behindDoc="0" distT="0" distB="0" distL="0" distR="0" simplePos="0" locked="0" layoutInCell="0" allowOverlap="1" relativeHeight="56">
             <wp:simplePos x="0" y="0"/>
             <wp:positionH relativeFrom="column">
               <wp:align>center</wp:align>
@@ -9097,15 +8908,7 @@
       </w:pPr>
       <w:r>
         <w:rPr/>
-        <w:t>Slik</w:t>
-      </w:r>
-      <w:r>
-        <w:rPr/>
-        <w:t>e</w:t>
-      </w:r>
-      <w:r>
-        <w:rPr/>
-        <w:t xml:space="preserve"> 3.6 Povezivanje IMD-a</w:t>
+        <w:t>Slike 3.6 Povezivanje IMD-a</w:t>
       </w:r>
     </w:p>
     <w:p>
@@ -9622,9 +9425,11 @@
         </w:rPr>
       </w:pPr>
       <w:r>
-        <w:rPr/>
+        <w:rPr>
+          <w:lang w:val="sr-Latn-RS"/>
+        </w:rPr>
         <w:drawing>
-          <wp:anchor behindDoc="0" distT="0" distB="0" distL="0" distR="0" simplePos="0" locked="0" layoutInCell="0" allowOverlap="1" relativeHeight="68">
+          <wp:anchor behindDoc="0" distT="0" distB="0" distL="0" distR="0" simplePos="0" locked="0" layoutInCell="0" allowOverlap="1" relativeHeight="54">
             <wp:simplePos x="0" y="0"/>
             <wp:positionH relativeFrom="column">
               <wp:align>center</wp:align>
@@ -9679,7 +9484,9 @@
         </w:rPr>
       </w:pPr>
       <w:r>
-        <w:rPr/>
+        <w:rPr>
+          <w:lang w:val="sr-Latn-RS"/>
+        </w:rPr>
       </w:r>
     </w:p>
     <w:p>
@@ -9691,7 +9498,9 @@
         </w:rPr>
       </w:pPr>
       <w:r>
-        <w:rPr/>
+        <w:rPr>
+          <w:lang w:val="sr-Latn-RS"/>
+        </w:rPr>
       </w:r>
     </w:p>
     <w:p>
@@ -9703,7 +9512,9 @@
         </w:rPr>
       </w:pPr>
       <w:r>
-        <w:rPr/>
+        <w:rPr>
+          <w:lang w:val="sr-Latn-RS"/>
+        </w:rPr>
       </w:r>
     </w:p>
     <w:p>
@@ -9715,7 +9526,9 @@
         </w:rPr>
       </w:pPr>
       <w:r>
-        <w:rPr/>
+        <w:rPr>
+          <w:lang w:val="sr-Latn-RS"/>
+        </w:rPr>
       </w:r>
     </w:p>
     <w:p>
@@ -9727,7 +9540,9 @@
         </w:rPr>
       </w:pPr>
       <w:r>
-        <w:rPr/>
+        <w:rPr>
+          <w:lang w:val="sr-Latn-RS"/>
+        </w:rPr>
       </w:r>
     </w:p>
     <w:p>
@@ -9739,7 +9554,9 @@
         </w:rPr>
       </w:pPr>
       <w:r>
-        <w:rPr/>
+        <w:rPr>
+          <w:lang w:val="sr-Latn-RS"/>
+        </w:rPr>
       </w:r>
     </w:p>
     <w:p>
@@ -9751,7 +9568,9 @@
         </w:rPr>
       </w:pPr>
       <w:r>
-        <w:rPr/>
+        <w:rPr>
+          <w:lang w:val="sr-Latn-RS"/>
+        </w:rPr>
       </w:r>
     </w:p>
     <w:p>
@@ -9763,7 +9582,9 @@
         </w:rPr>
       </w:pPr>
       <w:r>
-        <w:rPr/>
+        <w:rPr>
+          <w:lang w:val="sr-Latn-RS"/>
+        </w:rPr>
       </w:r>
     </w:p>
     <w:p>
@@ -9775,7 +9596,9 @@
         </w:rPr>
       </w:pPr>
       <w:r>
-        <w:rPr/>
+        <w:rPr>
+          <w:lang w:val="sr-Latn-RS"/>
+        </w:rPr>
       </w:r>
     </w:p>
     <w:p>
@@ -9826,23 +9649,7 @@
           <w:szCs w:val="28"/>
           <w:lang w:val="sr-Latn-RS"/>
         </w:rPr>
-        <w:t xml:space="preserve">AMS, </w:t>
-      </w:r>
-      <w:r>
-        <w:rPr>
-          <w:iCs/>
-          <w:szCs w:val="28"/>
-          <w:lang w:val="sr-Latn-RS"/>
-        </w:rPr>
-        <w:t>BSPD i</w:t>
-      </w:r>
-      <w:r>
-        <w:rPr>
-          <w:iCs/>
-          <w:szCs w:val="28"/>
-          <w:lang w:val="sr-Latn-RS"/>
-        </w:rPr>
-        <w:t xml:space="preserve"> IMD leč</w:t>
+        <w:t>AMS, BSPD i IMD leč</w:t>
       </w:r>
     </w:p>
     <w:p>
@@ -9858,72 +9665,23 @@
           <w:rFonts w:cs="Aptos" w:cstheme="minorHAnsi"/>
           <w:lang w:val="sr-Latn-RS"/>
         </w:rPr>
-        <w:t xml:space="preserve">Pošto je potrebno dobiti HIGH izlaz (za zatvaranje releja u serijskoj vezi SDC) samo kada su </w:t>
-      </w:r>
-      <w:r>
+        <w:t>Pošto je potrebno dobiti HIGH izlaz (za zatvaranje releja u serijskoj vezi SDC) samo kada su sva tri signala u stanju „OK“, a AMS radi na inverznoj logici, nije moguće direktno povezati ova tri signala na AND kolo.</w:t>
+      </w:r>
+    </w:p>
+    <w:p>
+      <w:pPr>
+        <w:pStyle w:val="Normal"/>
         <w:rPr>
           <w:rFonts w:cs="Aptos" w:cstheme="minorHAnsi"/>
           <w:lang w:val="sr-Latn-RS"/>
         </w:rPr>
-        <w:t>sva tri</w:t>
-      </w:r>
+      </w:pPr>
       <w:r>
         <w:rPr>
           <w:rFonts w:cs="Aptos" w:cstheme="minorHAnsi"/>
           <w:lang w:val="sr-Latn-RS"/>
         </w:rPr>
-        <w:t xml:space="preserve"> signala u stanju „OK“, </w:t>
-      </w:r>
-      <w:r>
-        <w:rPr>
-          <w:rFonts w:cs="Aptos" w:cstheme="minorHAnsi"/>
-          <w:lang w:val="sr-Latn-RS"/>
-        </w:rPr>
-        <w:t>a AMS radi na inverznoj logici,</w:t>
-      </w:r>
-      <w:r>
-        <w:rPr>
-          <w:rFonts w:cs="Aptos" w:cstheme="minorHAnsi"/>
-          <w:lang w:val="sr-Latn-RS"/>
-        </w:rPr>
-        <w:t xml:space="preserve"> nije moguće direktno povezati ova </w:t>
-      </w:r>
-      <w:r>
-        <w:rPr>
-          <w:rFonts w:cs="Aptos" w:cstheme="minorHAnsi"/>
-          <w:lang w:val="sr-Latn-RS"/>
-        </w:rPr>
-        <w:t>tri</w:t>
-      </w:r>
-      <w:r>
-        <w:rPr>
-          <w:rFonts w:cs="Aptos" w:cstheme="minorHAnsi"/>
-          <w:lang w:val="sr-Latn-RS"/>
-        </w:rPr>
-        <w:t xml:space="preserve"> signala na AND kolo.</w:t>
-      </w:r>
-    </w:p>
-    <w:p>
-      <w:pPr>
-        <w:pStyle w:val="Normal"/>
-        <w:rPr>
-          <w:rFonts w:cs="Aptos" w:cstheme="minorHAnsi"/>
-          <w:lang w:val="sr-Latn-RS"/>
-        </w:rPr>
-      </w:pPr>
-      <w:r>
-        <w:rPr>
-          <w:rFonts w:cs="Aptos" w:cstheme="minorHAnsi"/>
-          <w:lang w:val="sr-Latn-RS"/>
-        </w:rPr>
-        <w:t>Stoga je leč mehanizam implementiran na sledeći način</w:t>
-      </w:r>
-      <w:r>
-        <w:rPr>
-          <w:rFonts w:cs="Aptos" w:cstheme="minorHAnsi"/>
-          <w:lang w:val="sr-Latn-RS"/>
-        </w:rPr>
-        <w:t>:</w:t>
+        <w:t>Stoga je leč mehanizam implementiran na sledeći način:</w:t>
       </w:r>
     </w:p>
     <w:p>
@@ -9955,9 +9713,12 @@
         </w:rPr>
       </w:pPr>
       <w:r>
-        <w:rPr/>
+        <w:rPr>
+          <w:rFonts w:cs="Aptos" w:cstheme="minorHAnsi"/>
+          <w:lang w:val="sr-Latn-RS"/>
+        </w:rPr>
         <w:drawing>
-          <wp:anchor behindDoc="0" distT="0" distB="0" distL="0" distR="0" simplePos="0" locked="0" layoutInCell="0" allowOverlap="1" relativeHeight="71">
+          <wp:anchor behindDoc="0" distT="0" distB="0" distL="0" distR="0" simplePos="0" locked="0" layoutInCell="0" allowOverlap="1" relativeHeight="57">
             <wp:simplePos x="0" y="0"/>
             <wp:positionH relativeFrom="column">
               <wp:align>center</wp:align>
@@ -10012,19 +9773,10 @@
         </w:rPr>
       </w:pPr>
       <w:r>
-        <w:rPr/>
-      </w:r>
-    </w:p>
-    <w:p>
-      <w:pPr>
-        <w:pStyle w:val="Normal"/>
         <w:rPr>
           <w:rFonts w:cs="Aptos" w:cstheme="minorHAnsi"/>
           <w:lang w:val="sr-Latn-RS"/>
         </w:rPr>
-      </w:pPr>
-      <w:r>
-        <w:rPr/>
       </w:r>
     </w:p>
     <w:p>
@@ -10036,19 +9788,10 @@
         </w:rPr>
       </w:pPr>
       <w:r>
-        <w:rPr/>
-      </w:r>
-    </w:p>
-    <w:p>
-      <w:pPr>
-        <w:pStyle w:val="Normal"/>
         <w:rPr>
           <w:rFonts w:cs="Aptos" w:cstheme="minorHAnsi"/>
           <w:lang w:val="sr-Latn-RS"/>
         </w:rPr>
-      </w:pPr>
-      <w:r>
-        <w:rPr/>
       </w:r>
     </w:p>
     <w:p>
@@ -10060,7 +9803,40 @@
         </w:rPr>
       </w:pPr>
       <w:r>
-        <w:rPr/>
+        <w:rPr>
+          <w:rFonts w:cs="Aptos" w:cstheme="minorHAnsi"/>
+          <w:lang w:val="sr-Latn-RS"/>
+        </w:rPr>
+      </w:r>
+    </w:p>
+    <w:p>
+      <w:pPr>
+        <w:pStyle w:val="Normal"/>
+        <w:rPr>
+          <w:rFonts w:cs="Aptos" w:cstheme="minorHAnsi"/>
+          <w:lang w:val="sr-Latn-RS"/>
+        </w:rPr>
+      </w:pPr>
+      <w:r>
+        <w:rPr>
+          <w:rFonts w:cs="Aptos" w:cstheme="minorHAnsi"/>
+          <w:lang w:val="sr-Latn-RS"/>
+        </w:rPr>
+      </w:r>
+    </w:p>
+    <w:p>
+      <w:pPr>
+        <w:pStyle w:val="Normal"/>
+        <w:rPr>
+          <w:rFonts w:cs="Aptos" w:cstheme="minorHAnsi"/>
+          <w:lang w:val="sr-Latn-RS"/>
+        </w:rPr>
+      </w:pPr>
+      <w:r>
+        <w:rPr>
+          <w:rFonts w:cs="Aptos" w:cstheme="minorHAnsi"/>
+          <w:lang w:val="sr-Latn-RS"/>
+        </w:rPr>
       </w:r>
     </w:p>
     <w:p>
@@ -10096,56 +9872,24 @@
           <w:rFonts w:cs="Aptos" w:cstheme="minorHAnsi"/>
           <w:lang w:val="sr-Latn-RS"/>
         </w:rPr>
-        <w:t>Potom se taj AND-ovan signal dovodi, zajedno sa AMS signalom, na</w:t>
-      </w:r>
-      <w:r>
+        <w:t>Potom se taj AND-ovan signal dovodi, zajedno sa AMS signalom, na dve NAND kapije kako bi se formirali odgovarajući invertovani signali. Njihovi izlazi se zatim vode na treću NAND kapiju, koja invertuje rezultat i daje željeni AND izlaz – odnosno dobijamo HIGH izlaz kada je sve OK, i LOW u slučaju greške.</w:t>
+      </w:r>
+    </w:p>
+    <w:p>
+      <w:pPr>
+        <w:pStyle w:val="Normal"/>
         <w:rPr>
           <w:rFonts w:cs="Aptos" w:cstheme="minorHAnsi"/>
           <w:lang w:val="sr-Latn-RS"/>
         </w:rPr>
-        <w:t xml:space="preserve"> dve NAND kapije kako bi se formirali odgovarajući invertovani signali. </w:t>
-      </w:r>
+      </w:pPr>
       <w:r>
         <w:rPr>
           <w:rFonts w:cs="Aptos" w:cstheme="minorHAnsi"/>
           <w:lang w:val="sr-Latn-RS"/>
         </w:rPr>
-        <w:t>Nj</w:t>
-      </w:r>
-      <w:r>
-        <w:rPr>
-          <w:rFonts w:cs="Aptos" w:cstheme="minorHAnsi"/>
-          <w:lang w:val="sr-Latn-RS"/>
-        </w:rPr>
-        <w:t xml:space="preserve">ihovi izlazi se zatim vode na treću NAND kapiju, koja invertuje rezultat i daje željeni AND izlaz – </w:t>
-      </w:r>
-      <w:r>
-        <w:rPr>
-          <w:rFonts w:cs="Aptos" w:cstheme="minorHAnsi"/>
-          <w:lang w:val="sr-Latn-RS"/>
-        </w:rPr>
-        <w:t>odnosno dobijamo HIGH izlaz kada je sve OK, i LOW u slučaju greške</w:t>
-      </w:r>
-      <w:r>
-        <w:rPr>
-          <w:rFonts w:cs="Aptos" w:cstheme="minorHAnsi"/>
-          <w:lang w:val="sr-Latn-RS"/>
-        </w:rPr>
-        <w:t>.</w:t>
-      </w:r>
-    </w:p>
-    <w:p>
-      <w:pPr>
-        <w:pStyle w:val="Normal"/>
-        <w:rPr>
-          <w:rFonts w:cs="Aptos" w:cstheme="minorHAnsi"/>
-          <w:lang w:val="sr-Latn-RS"/>
-        </w:rPr>
-      </w:pPr>
-      <w:r>
-        <w:rPr/>
         <w:drawing>
-          <wp:anchor behindDoc="0" distT="0" distB="0" distL="0" distR="0" simplePos="0" locked="0" layoutInCell="0" allowOverlap="1" relativeHeight="72">
+          <wp:anchor behindDoc="0" distT="0" distB="0" distL="0" distR="0" simplePos="0" locked="0" layoutInCell="0" allowOverlap="1" relativeHeight="58">
             <wp:simplePos x="0" y="0"/>
             <wp:positionH relativeFrom="column">
               <wp:align>center</wp:align>
@@ -10200,19 +9944,10 @@
         </w:rPr>
       </w:pPr>
       <w:r>
-        <w:rPr/>
-      </w:r>
-    </w:p>
-    <w:p>
-      <w:pPr>
-        <w:pStyle w:val="Normal"/>
         <w:rPr>
           <w:rFonts w:cs="Aptos" w:cstheme="minorHAnsi"/>
           <w:lang w:val="sr-Latn-RS"/>
         </w:rPr>
-      </w:pPr>
-      <w:r>
-        <w:rPr/>
       </w:r>
     </w:p>
     <w:p>
@@ -10224,19 +9959,10 @@
         </w:rPr>
       </w:pPr>
       <w:r>
-        <w:rPr/>
-      </w:r>
-    </w:p>
-    <w:p>
-      <w:pPr>
-        <w:pStyle w:val="Normal"/>
         <w:rPr>
           <w:rFonts w:cs="Aptos" w:cstheme="minorHAnsi"/>
           <w:lang w:val="sr-Latn-RS"/>
         </w:rPr>
-      </w:pPr>
-      <w:r>
-        <w:rPr/>
       </w:r>
     </w:p>
     <w:p>
@@ -10248,19 +9974,10 @@
         </w:rPr>
       </w:pPr>
       <w:r>
-        <w:rPr/>
-      </w:r>
-    </w:p>
-    <w:p>
-      <w:pPr>
-        <w:pStyle w:val="Normal"/>
         <w:rPr>
           <w:rFonts w:cs="Aptos" w:cstheme="minorHAnsi"/>
           <w:lang w:val="sr-Latn-RS"/>
         </w:rPr>
-      </w:pPr>
-      <w:r>
-        <w:rPr/>
       </w:r>
     </w:p>
     <w:p>
@@ -10272,19 +9989,10 @@
         </w:rPr>
       </w:pPr>
       <w:r>
-        <w:rPr/>
-      </w:r>
-    </w:p>
-    <w:p>
-      <w:pPr>
-        <w:pStyle w:val="Normal"/>
         <w:rPr>
           <w:rFonts w:cs="Aptos" w:cstheme="minorHAnsi"/>
           <w:lang w:val="sr-Latn-RS"/>
         </w:rPr>
-      </w:pPr>
-      <w:r>
-        <w:rPr/>
       </w:r>
     </w:p>
     <w:p>
@@ -10296,19 +10004,10 @@
         </w:rPr>
       </w:pPr>
       <w:r>
-        <w:rPr/>
-      </w:r>
-    </w:p>
-    <w:p>
-      <w:pPr>
-        <w:pStyle w:val="Normal"/>
         <w:rPr>
           <w:rFonts w:cs="Aptos" w:cstheme="minorHAnsi"/>
           <w:lang w:val="sr-Latn-RS"/>
         </w:rPr>
-      </w:pPr>
-      <w:r>
-        <w:rPr/>
       </w:r>
     </w:p>
     <w:p>
@@ -10320,22 +10019,100 @@
         </w:rPr>
       </w:pPr>
       <w:r>
-        <w:rPr/>
-      </w:r>
-    </w:p>
-    <w:p>
-      <w:pPr>
-        <w:pStyle w:val="Normal"/>
         <w:rPr>
           <w:rFonts w:cs="Aptos" w:cstheme="minorHAnsi"/>
           <w:lang w:val="sr-Latn-RS"/>
         </w:rPr>
-      </w:pPr>
-      <w:r>
+      </w:r>
+    </w:p>
+    <w:p>
+      <w:pPr>
+        <w:pStyle w:val="Normal"/>
         <w:rPr>
           <w:rFonts w:cs="Aptos" w:cstheme="minorHAnsi"/>
           <w:lang w:val="sr-Latn-RS"/>
         </w:rPr>
+      </w:pPr>
+      <w:r>
+        <w:rPr>
+          <w:rFonts w:cs="Aptos" w:cstheme="minorHAnsi"/>
+          <w:lang w:val="sr-Latn-RS"/>
+        </w:rPr>
+      </w:r>
+    </w:p>
+    <w:p>
+      <w:pPr>
+        <w:pStyle w:val="Normal"/>
+        <w:rPr>
+          <w:rFonts w:cs="Aptos" w:cstheme="minorHAnsi"/>
+          <w:lang w:val="sr-Latn-RS"/>
+        </w:rPr>
+      </w:pPr>
+      <w:r>
+        <w:rPr>
+          <w:rFonts w:cs="Aptos" w:cstheme="minorHAnsi"/>
+          <w:lang w:val="sr-Latn-RS"/>
+        </w:rPr>
+      </w:r>
+    </w:p>
+    <w:p>
+      <w:pPr>
+        <w:pStyle w:val="Normal"/>
+        <w:rPr>
+          <w:rFonts w:cs="Aptos" w:cstheme="minorHAnsi"/>
+          <w:lang w:val="sr-Latn-RS"/>
+        </w:rPr>
+      </w:pPr>
+      <w:r>
+        <w:rPr>
+          <w:rFonts w:cs="Aptos" w:cstheme="minorHAnsi"/>
+          <w:lang w:val="sr-Latn-RS"/>
+        </w:rPr>
+      </w:r>
+    </w:p>
+    <w:p>
+      <w:pPr>
+        <w:pStyle w:val="Normal"/>
+        <w:rPr>
+          <w:rFonts w:cs="Aptos" w:cstheme="minorHAnsi"/>
+          <w:lang w:val="sr-Latn-RS"/>
+        </w:rPr>
+      </w:pPr>
+      <w:r>
+        <w:rPr>
+          <w:rFonts w:cs="Aptos" w:cstheme="minorHAnsi"/>
+          <w:lang w:val="sr-Latn-RS"/>
+        </w:rPr>
+      </w:r>
+    </w:p>
+    <w:p>
+      <w:pPr>
+        <w:pStyle w:val="Normal"/>
+        <w:rPr>
+          <w:rFonts w:cs="Aptos" w:cstheme="minorHAnsi"/>
+          <w:lang w:val="sr-Latn-RS"/>
+        </w:rPr>
+      </w:pPr>
+      <w:r>
+        <w:rPr>
+          <w:rFonts w:cs="Aptos" w:cstheme="minorHAnsi"/>
+          <w:lang w:val="sr-Latn-RS"/>
+        </w:rPr>
+      </w:r>
+    </w:p>
+    <w:p>
+      <w:pPr>
+        <w:pStyle w:val="Normal"/>
+        <w:rPr>
+          <w:rFonts w:cs="Aptos" w:cstheme="minorHAnsi"/>
+          <w:lang w:val="sr-Latn-RS"/>
+        </w:rPr>
+      </w:pPr>
+      <w:r>
+        <w:rPr>
+          <w:rFonts w:cs="Aptos" w:cstheme="minorHAnsi"/>
+          <w:lang w:val="sr-Latn-RS"/>
+        </w:rPr>
         <w:br/>
       </w:r>
     </w:p>
@@ -10396,7 +10173,10 @@
         </w:rPr>
       </w:pPr>
       <w:r>
-        <w:rPr/>
+        <w:rPr>
+          <w:rFonts w:cs="Aptos" w:cstheme="minorHAnsi"/>
+          <w:lang w:val="sr-Latn-RS"/>
+        </w:rPr>
       </w:r>
     </w:p>
     <w:p>
@@ -10432,35 +10212,21 @@
           <w:rFonts w:cs="Aptos" w:cstheme="minorHAnsi"/>
           <w:lang w:val="sr-Latn-RS"/>
         </w:rPr>
-        <w:t>Na kraju, izlaz RC kola i signal IMD&amp;</w:t>
-      </w:r>
-      <w:r>
+        <w:t>Na kraju, izlaz RC kola i signal IMD&amp;BSPD&amp;AMS se dovode na NAND kapiju, a njen izlaz se koristi kao signal za RST1 pin CD4013 flip-flopa.</w:t>
+      </w:r>
+    </w:p>
+    <w:p>
+      <w:pPr>
+        <w:pStyle w:val="Normal"/>
+        <w:jc w:val="center"/>
         <w:rPr>
           <w:rFonts w:cs="Aptos" w:cstheme="minorHAnsi"/>
           <w:lang w:val="sr-Latn-RS"/>
         </w:rPr>
-        <w:t>BSPD</w:t>
-      </w:r>
-      <w:r>
-        <w:rPr>
-          <w:rFonts w:cs="Aptos" w:cstheme="minorHAnsi"/>
-          <w:lang w:val="sr-Latn-RS"/>
-        </w:rPr>
-        <w:t>&amp;AMS se dovode na NAND kapiju, a njen izlaz se koristi kao signal za RST1 pin CD4013 flip-flopa.</w:t>
-      </w:r>
-    </w:p>
-    <w:p>
-      <w:pPr>
-        <w:pStyle w:val="Normal"/>
-        <w:jc w:val="center"/>
-        <w:rPr>
-          <w:rFonts w:cs="Aptos" w:cstheme="minorHAnsi"/>
-          <w:lang w:val="sr-Latn-RS"/>
-        </w:rPr>
       </w:pPr>
       <w:r>
         <w:drawing>
-          <wp:anchor behindDoc="0" distT="0" distB="0" distL="0" distR="0" simplePos="0" locked="0" layoutInCell="0" allowOverlap="1" relativeHeight="73">
+          <wp:anchor behindDoc="0" distT="0" distB="0" distL="0" distR="0" simplePos="0" locked="0" layoutInCell="0" allowOverlap="1" relativeHeight="64">
             <wp:simplePos x="0" y="0"/>
             <wp:positionH relativeFrom="column">
               <wp:align>center</wp:align>
@@ -10604,13 +10370,13 @@
       </w:tblPr>
       <w:tblGrid>
         <w:gridCol w:w="562"/>
-        <w:gridCol w:w="1801"/>
-        <w:gridCol w:w="1448"/>
-        <w:gridCol w:w="805"/>
+        <w:gridCol w:w="1800"/>
+        <w:gridCol w:w="1449"/>
+        <w:gridCol w:w="804"/>
         <w:gridCol w:w="1069"/>
-        <w:gridCol w:w="544"/>
-        <w:gridCol w:w="2613"/>
-        <w:gridCol w:w="1608"/>
+        <w:gridCol w:w="545"/>
+        <w:gridCol w:w="2612"/>
+        <w:gridCol w:w="1607"/>
       </w:tblGrid>
       <w:tr>
         <w:trPr/>
@@ -10648,7 +10414,7 @@
         </w:tc>
         <w:tc>
           <w:tcPr>
-            <w:tcW w:w="1801" w:type="dxa"/>
+            <w:tcW w:w="1800" w:type="dxa"/>
             <w:tcBorders/>
             <w:vAlign w:val="center"/>
           </w:tcPr>
@@ -10674,8 +10440,28 @@
                 <w:szCs w:val="24"/>
                 <w:lang w:val="sr-Latn-RS" w:eastAsia="en-US" w:bidi="ar-SA"/>
               </w:rPr>
-              <w:t>I</w:t>
-            </w:r>
+              <w:t>IMD&amp;BSPD</w:t>
+            </w:r>
+          </w:p>
+        </w:tc>
+        <w:tc>
+          <w:tcPr>
+            <w:tcW w:w="1449" w:type="dxa"/>
+            <w:tcBorders/>
+            <w:vAlign w:val="center"/>
+          </w:tcPr>
+          <w:p>
+            <w:pPr>
+              <w:pStyle w:val="Normal"/>
+              <w:widowControl/>
+              <w:suppressAutoHyphens w:val="true"/>
+              <w:spacing w:before="0" w:after="0"/>
+              <w:jc w:val="center"/>
+              <w:rPr>
+                <w:rFonts w:cs="Times New Roman"/>
+                <w:lang w:val="sr-Latn-RS"/>
+              </w:rPr>
+            </w:pPr>
             <w:r>
               <w:rPr>
                 <w:rFonts w:eastAsia="Aptos" w:cs="Times New Roman"/>
@@ -10684,15 +10470,15 @@
                 <w:kern w:val="2"/>
                 <w:sz w:val="24"/>
                 <w:szCs w:val="24"/>
-                <w:lang w:val="sr-Latn-RS" w:eastAsia="en-US" w:bidi="ar-SA"/>
-              </w:rPr>
-              <w:t>MD&amp;BSPD</w:t>
-            </w:r>
-          </w:p>
-        </w:tc>
-        <w:tc>
-          <w:tcPr>
-            <w:tcW w:w="1448" w:type="dxa"/>
+                <w:lang w:val="en-US" w:eastAsia="en-US" w:bidi="ar-SA"/>
+              </w:rPr>
+              <w:t>AMS</w:t>
+            </w:r>
+          </w:p>
+        </w:tc>
+        <w:tc>
+          <w:tcPr>
+            <w:tcW w:w="804" w:type="dxa"/>
             <w:tcBorders/>
             <w:vAlign w:val="center"/>
           </w:tcPr>
@@ -10718,13 +10504,13 @@
                 <w:szCs w:val="24"/>
                 <w:lang w:val="en-US" w:eastAsia="en-US" w:bidi="ar-SA"/>
               </w:rPr>
-              <w:t>AMS</w:t>
-            </w:r>
-          </w:p>
-        </w:tc>
-        <w:tc>
-          <w:tcPr>
-            <w:tcW w:w="805" w:type="dxa"/>
+              <w:t>RST1</w:t>
+            </w:r>
+          </w:p>
+        </w:tc>
+        <w:tc>
+          <w:tcPr>
+            <w:tcW w:w="1069" w:type="dxa"/>
             <w:tcBorders/>
             <w:vAlign w:val="center"/>
           </w:tcPr>
@@ -10750,13 +10536,13 @@
                 <w:szCs w:val="24"/>
                 <w:lang w:val="en-US" w:eastAsia="en-US" w:bidi="ar-SA"/>
               </w:rPr>
-              <w:t>RST1</w:t>
-            </w:r>
-          </w:p>
-        </w:tc>
-        <w:tc>
-          <w:tcPr>
-            <w:tcW w:w="1069" w:type="dxa"/>
+              <w:t>CLK1</w:t>
+            </w:r>
+          </w:p>
+        </w:tc>
+        <w:tc>
+          <w:tcPr>
+            <w:tcW w:w="545" w:type="dxa"/>
             <w:tcBorders/>
             <w:vAlign w:val="center"/>
           </w:tcPr>
@@ -10782,13 +10568,13 @@
                 <w:szCs w:val="24"/>
                 <w:lang w:val="en-US" w:eastAsia="en-US" w:bidi="ar-SA"/>
               </w:rPr>
-              <w:t>CLK1</w:t>
-            </w:r>
-          </w:p>
-        </w:tc>
-        <w:tc>
-          <w:tcPr>
-            <w:tcW w:w="544" w:type="dxa"/>
+              <w:t>Q1</w:t>
+            </w:r>
+          </w:p>
+        </w:tc>
+        <w:tc>
+          <w:tcPr>
+            <w:tcW w:w="2612" w:type="dxa"/>
             <w:tcBorders/>
             <w:vAlign w:val="center"/>
           </w:tcPr>
@@ -10814,45 +10600,13 @@
                 <w:szCs w:val="24"/>
                 <w:lang w:val="en-US" w:eastAsia="en-US" w:bidi="ar-SA"/>
               </w:rPr>
-              <w:t>Q1</w:t>
-            </w:r>
-          </w:p>
-        </w:tc>
-        <w:tc>
-          <w:tcPr>
-            <w:tcW w:w="2613" w:type="dxa"/>
-            <w:tcBorders/>
-            <w:vAlign w:val="center"/>
-          </w:tcPr>
-          <w:p>
-            <w:pPr>
-              <w:pStyle w:val="Normal"/>
-              <w:widowControl/>
-              <w:suppressAutoHyphens w:val="true"/>
-              <w:spacing w:before="0" w:after="0"/>
-              <w:jc w:val="center"/>
-              <w:rPr>
-                <w:rFonts w:cs="Times New Roman"/>
-                <w:lang w:val="sr-Latn-RS"/>
-              </w:rPr>
-            </w:pPr>
-            <w:r>
-              <w:rPr>
-                <w:rFonts w:eastAsia="Aptos" w:cs="Times New Roman"/>
-                <w:b/>
-                <w:bCs/>
-                <w:kern w:val="2"/>
-                <w:sz w:val="24"/>
-                <w:szCs w:val="24"/>
-                <w:lang w:val="en-US" w:eastAsia="en-US" w:bidi="ar-SA"/>
-              </w:rPr>
               <w:t>Objašnjenje</w:t>
             </w:r>
           </w:p>
         </w:tc>
         <w:tc>
           <w:tcPr>
-            <w:tcW w:w="1608" w:type="dxa"/>
+            <w:tcW w:w="1607" w:type="dxa"/>
             <w:tcBorders/>
           </w:tcPr>
           <w:p>
@@ -10919,7 +10673,7 @@
         </w:tc>
         <w:tc>
           <w:tcPr>
-            <w:tcW w:w="1801" w:type="dxa"/>
+            <w:tcW w:w="1800" w:type="dxa"/>
             <w:tcBorders/>
             <w:vAlign w:val="center"/>
           </w:tcPr>
@@ -10949,7 +10703,7 @@
         </w:tc>
         <w:tc>
           <w:tcPr>
-            <w:tcW w:w="1448" w:type="dxa"/>
+            <w:tcW w:w="1449" w:type="dxa"/>
             <w:tcBorders/>
             <w:vAlign w:val="center"/>
           </w:tcPr>
@@ -10979,7 +10733,7 @@
         </w:tc>
         <w:tc>
           <w:tcPr>
-            <w:tcW w:w="805" w:type="dxa"/>
+            <w:tcW w:w="804" w:type="dxa"/>
             <w:tcBorders/>
             <w:vAlign w:val="center"/>
           </w:tcPr>
@@ -11039,7 +10793,7 @@
         </w:tc>
         <w:tc>
           <w:tcPr>
-            <w:tcW w:w="544" w:type="dxa"/>
+            <w:tcW w:w="545" w:type="dxa"/>
             <w:tcBorders/>
             <w:vAlign w:val="center"/>
           </w:tcPr>
@@ -11069,7 +10823,7 @@
         </w:tc>
         <w:tc>
           <w:tcPr>
-            <w:tcW w:w="2613" w:type="dxa"/>
+            <w:tcW w:w="2612" w:type="dxa"/>
             <w:tcBorders/>
             <w:vAlign w:val="center"/>
           </w:tcPr>
@@ -11098,7 +10852,7 @@
         </w:tc>
         <w:tc>
           <w:tcPr>
-            <w:tcW w:w="1608" w:type="dxa"/>
+            <w:tcW w:w="1607" w:type="dxa"/>
             <w:tcBorders/>
           </w:tcPr>
           <w:p>
@@ -11158,7 +10912,7 @@
         </w:tc>
         <w:tc>
           <w:tcPr>
-            <w:tcW w:w="1801" w:type="dxa"/>
+            <w:tcW w:w="1800" w:type="dxa"/>
             <w:tcBorders/>
             <w:vAlign w:val="center"/>
           </w:tcPr>
@@ -11188,7 +10942,7 @@
         </w:tc>
         <w:tc>
           <w:tcPr>
-            <w:tcW w:w="1448" w:type="dxa"/>
+            <w:tcW w:w="1449" w:type="dxa"/>
             <w:tcBorders/>
             <w:vAlign w:val="center"/>
           </w:tcPr>
@@ -11218,7 +10972,7 @@
         </w:tc>
         <w:tc>
           <w:tcPr>
-            <w:tcW w:w="805" w:type="dxa"/>
+            <w:tcW w:w="804" w:type="dxa"/>
             <w:tcBorders/>
             <w:vAlign w:val="center"/>
           </w:tcPr>
@@ -11278,7 +11032,7 @@
         </w:tc>
         <w:tc>
           <w:tcPr>
-            <w:tcW w:w="544" w:type="dxa"/>
+            <w:tcW w:w="545" w:type="dxa"/>
             <w:tcBorders/>
             <w:vAlign w:val="center"/>
           </w:tcPr>
@@ -11308,7 +11062,7 @@
         </w:tc>
         <w:tc>
           <w:tcPr>
-            <w:tcW w:w="2613" w:type="dxa"/>
+            <w:tcW w:w="2612" w:type="dxa"/>
             <w:tcBorders/>
             <w:vAlign w:val="center"/>
           </w:tcPr>
@@ -11337,7 +11091,7 @@
         </w:tc>
         <w:tc>
           <w:tcPr>
-            <w:tcW w:w="1608" w:type="dxa"/>
+            <w:tcW w:w="1607" w:type="dxa"/>
             <w:tcBorders/>
           </w:tcPr>
           <w:p>
@@ -11397,7 +11151,7 @@
         </w:tc>
         <w:tc>
           <w:tcPr>
-            <w:tcW w:w="1801" w:type="dxa"/>
+            <w:tcW w:w="1800" w:type="dxa"/>
             <w:tcBorders/>
             <w:vAlign w:val="center"/>
           </w:tcPr>
@@ -11427,7 +11181,7 @@
         </w:tc>
         <w:tc>
           <w:tcPr>
-            <w:tcW w:w="1448" w:type="dxa"/>
+            <w:tcW w:w="1449" w:type="dxa"/>
             <w:tcBorders/>
             <w:vAlign w:val="center"/>
           </w:tcPr>
@@ -11457,7 +11211,7 @@
         </w:tc>
         <w:tc>
           <w:tcPr>
-            <w:tcW w:w="805" w:type="dxa"/>
+            <w:tcW w:w="804" w:type="dxa"/>
             <w:tcBorders/>
             <w:vAlign w:val="center"/>
           </w:tcPr>
@@ -11517,7 +11271,7 @@
         </w:tc>
         <w:tc>
           <w:tcPr>
-            <w:tcW w:w="544" w:type="dxa"/>
+            <w:tcW w:w="545" w:type="dxa"/>
             <w:tcBorders/>
             <w:vAlign w:val="center"/>
           </w:tcPr>
@@ -11547,7 +11301,7 @@
         </w:tc>
         <w:tc>
           <w:tcPr>
-            <w:tcW w:w="2613" w:type="dxa"/>
+            <w:tcW w:w="2612" w:type="dxa"/>
             <w:tcBorders/>
             <w:vAlign w:val="center"/>
           </w:tcPr>
@@ -11577,7 +11331,7 @@
         </w:tc>
         <w:tc>
           <w:tcPr>
-            <w:tcW w:w="1608" w:type="dxa"/>
+            <w:tcW w:w="1607" w:type="dxa"/>
             <w:tcBorders/>
           </w:tcPr>
           <w:p>
@@ -11637,7 +11391,7 @@
         </w:tc>
         <w:tc>
           <w:tcPr>
-            <w:tcW w:w="1801" w:type="dxa"/>
+            <w:tcW w:w="1800" w:type="dxa"/>
             <w:tcBorders/>
             <w:vAlign w:val="center"/>
           </w:tcPr>
@@ -11667,7 +11421,7 @@
         </w:tc>
         <w:tc>
           <w:tcPr>
-            <w:tcW w:w="1448" w:type="dxa"/>
+            <w:tcW w:w="1449" w:type="dxa"/>
             <w:tcBorders/>
             <w:vAlign w:val="center"/>
           </w:tcPr>
@@ -11697,7 +11451,7 @@
         </w:tc>
         <w:tc>
           <w:tcPr>
-            <w:tcW w:w="805" w:type="dxa"/>
+            <w:tcW w:w="804" w:type="dxa"/>
             <w:tcBorders/>
             <w:vAlign w:val="center"/>
           </w:tcPr>
@@ -11757,7 +11511,7 @@
         </w:tc>
         <w:tc>
           <w:tcPr>
-            <w:tcW w:w="544" w:type="dxa"/>
+            <w:tcW w:w="545" w:type="dxa"/>
             <w:tcBorders/>
             <w:vAlign w:val="center"/>
           </w:tcPr>
@@ -11787,7 +11541,7 @@
         </w:tc>
         <w:tc>
           <w:tcPr>
-            <w:tcW w:w="2613" w:type="dxa"/>
+            <w:tcW w:w="2612" w:type="dxa"/>
             <w:tcBorders/>
             <w:vAlign w:val="center"/>
           </w:tcPr>
@@ -11817,7 +11571,7 @@
         </w:tc>
         <w:tc>
           <w:tcPr>
-            <w:tcW w:w="1608" w:type="dxa"/>
+            <w:tcW w:w="1607" w:type="dxa"/>
             <w:tcBorders/>
           </w:tcPr>
           <w:p>
@@ -11877,7 +11631,7 @@
         </w:tc>
         <w:tc>
           <w:tcPr>
-            <w:tcW w:w="1801" w:type="dxa"/>
+            <w:tcW w:w="1800" w:type="dxa"/>
             <w:tcBorders/>
             <w:vAlign w:val="center"/>
           </w:tcPr>
@@ -11907,7 +11661,7 @@
         </w:tc>
         <w:tc>
           <w:tcPr>
-            <w:tcW w:w="1448" w:type="dxa"/>
+            <w:tcW w:w="1449" w:type="dxa"/>
             <w:tcBorders/>
             <w:vAlign w:val="center"/>
           </w:tcPr>
@@ -11937,7 +11691,7 @@
         </w:tc>
         <w:tc>
           <w:tcPr>
-            <w:tcW w:w="805" w:type="dxa"/>
+            <w:tcW w:w="804" w:type="dxa"/>
             <w:tcBorders/>
             <w:vAlign w:val="center"/>
           </w:tcPr>
@@ -11997,7 +11751,7 @@
         </w:tc>
         <w:tc>
           <w:tcPr>
-            <w:tcW w:w="544" w:type="dxa"/>
+            <w:tcW w:w="545" w:type="dxa"/>
             <w:tcBorders/>
             <w:vAlign w:val="center"/>
           </w:tcPr>
@@ -12027,7 +11781,7 @@
         </w:tc>
         <w:tc>
           <w:tcPr>
-            <w:tcW w:w="2613" w:type="dxa"/>
+            <w:tcW w:w="2612" w:type="dxa"/>
             <w:tcBorders/>
             <w:vAlign w:val="center"/>
           </w:tcPr>
@@ -12051,33 +11805,13 @@
                 <w:szCs w:val="24"/>
                 <w:lang w:val="en-US" w:eastAsia="en-US" w:bidi="ar-SA"/>
               </w:rPr>
-              <w:t>IMD</w:t>
-            </w:r>
-            <w:r>
-              <w:rPr>
-                <w:rFonts w:eastAsia="Aptos" w:cs="Times New Roman"/>
-                <w:kern w:val="2"/>
-                <w:sz w:val="24"/>
-                <w:szCs w:val="24"/>
-                <w:lang w:val="en-US" w:eastAsia="en-US" w:bidi="ar-SA"/>
-              </w:rPr>
-              <w:t>&amp;BSPD</w:t>
-            </w:r>
-            <w:r>
-              <w:rPr>
-                <w:rFonts w:eastAsia="Aptos" w:cs="Times New Roman"/>
-                <w:kern w:val="2"/>
-                <w:sz w:val="24"/>
-                <w:szCs w:val="24"/>
-                <w:lang w:val="en-US" w:eastAsia="en-US" w:bidi="ar-SA"/>
-              </w:rPr>
-              <w:t>=0 → greška, reset aktivan, Q1=0</w:t>
-            </w:r>
-          </w:p>
-        </w:tc>
-        <w:tc>
-          <w:tcPr>
-            <w:tcW w:w="1608" w:type="dxa"/>
+              <w:t>IMD&amp;BSPD=0 → greška, reset aktivan, Q1=0</w:t>
+            </w:r>
+          </w:p>
+        </w:tc>
+        <w:tc>
+          <w:tcPr>
+            <w:tcW w:w="1607" w:type="dxa"/>
             <w:tcBorders/>
           </w:tcPr>
           <w:p>
@@ -12136,7 +11870,7 @@
         </w:tc>
         <w:tc>
           <w:tcPr>
-            <w:tcW w:w="1801" w:type="dxa"/>
+            <w:tcW w:w="1800" w:type="dxa"/>
             <w:tcBorders/>
             <w:vAlign w:val="center"/>
           </w:tcPr>
@@ -12165,7 +11899,7 @@
         </w:tc>
         <w:tc>
           <w:tcPr>
-            <w:tcW w:w="1448" w:type="dxa"/>
+            <w:tcW w:w="1449" w:type="dxa"/>
             <w:tcBorders/>
             <w:vAlign w:val="center"/>
           </w:tcPr>
@@ -12194,7 +11928,7 @@
         </w:tc>
         <w:tc>
           <w:tcPr>
-            <w:tcW w:w="805" w:type="dxa"/>
+            <w:tcW w:w="804" w:type="dxa"/>
             <w:tcBorders/>
             <w:vAlign w:val="center"/>
           </w:tcPr>
@@ -12252,7 +11986,7 @@
         </w:tc>
         <w:tc>
           <w:tcPr>
-            <w:tcW w:w="544" w:type="dxa"/>
+            <w:tcW w:w="545" w:type="dxa"/>
             <w:tcBorders/>
             <w:vAlign w:val="center"/>
           </w:tcPr>
@@ -12281,7 +12015,7 @@
         </w:tc>
         <w:tc>
           <w:tcPr>
-            <w:tcW w:w="2613" w:type="dxa"/>
+            <w:tcW w:w="2612" w:type="dxa"/>
             <w:tcBorders/>
             <w:vAlign w:val="center"/>
           </w:tcPr>
@@ -12310,7 +12044,7 @@
         </w:tc>
         <w:tc>
           <w:tcPr>
-            <w:tcW w:w="1608" w:type="dxa"/>
+            <w:tcW w:w="1607" w:type="dxa"/>
             <w:tcBorders/>
           </w:tcPr>
           <w:p>
@@ -12370,7 +12104,7 @@
         </w:tc>
         <w:tc>
           <w:tcPr>
-            <w:tcW w:w="1801" w:type="dxa"/>
+            <w:tcW w:w="1800" w:type="dxa"/>
             <w:tcBorders/>
             <w:vAlign w:val="center"/>
           </w:tcPr>
@@ -12400,7 +12134,7 @@
         </w:tc>
         <w:tc>
           <w:tcPr>
-            <w:tcW w:w="1448" w:type="dxa"/>
+            <w:tcW w:w="1449" w:type="dxa"/>
             <w:tcBorders/>
             <w:vAlign w:val="center"/>
           </w:tcPr>
@@ -12430,7 +12164,7 @@
         </w:tc>
         <w:tc>
           <w:tcPr>
-            <w:tcW w:w="805" w:type="dxa"/>
+            <w:tcW w:w="804" w:type="dxa"/>
             <w:tcBorders/>
             <w:vAlign w:val="center"/>
           </w:tcPr>
@@ -12490,7 +12224,7 @@
         </w:tc>
         <w:tc>
           <w:tcPr>
-            <w:tcW w:w="544" w:type="dxa"/>
+            <w:tcW w:w="545" w:type="dxa"/>
             <w:tcBorders/>
             <w:vAlign w:val="center"/>
           </w:tcPr>
@@ -12520,7 +12254,7 @@
         </w:tc>
         <w:tc>
           <w:tcPr>
-            <w:tcW w:w="2613" w:type="dxa"/>
+            <w:tcW w:w="2612" w:type="dxa"/>
             <w:tcBorders/>
             <w:vAlign w:val="center"/>
           </w:tcPr>
@@ -12550,7 +12284,7 @@
         </w:tc>
         <w:tc>
           <w:tcPr>
-            <w:tcW w:w="1608" w:type="dxa"/>
+            <w:tcW w:w="1607" w:type="dxa"/>
             <w:tcBorders/>
           </w:tcPr>
           <w:p>
@@ -12609,7 +12343,7 @@
         </w:tc>
         <w:tc>
           <w:tcPr>
-            <w:tcW w:w="1801" w:type="dxa"/>
+            <w:tcW w:w="1800" w:type="dxa"/>
             <w:tcBorders/>
             <w:vAlign w:val="center"/>
           </w:tcPr>
@@ -12638,7 +12372,7 @@
         </w:tc>
         <w:tc>
           <w:tcPr>
-            <w:tcW w:w="1448" w:type="dxa"/>
+            <w:tcW w:w="1449" w:type="dxa"/>
             <w:tcBorders/>
             <w:vAlign w:val="center"/>
           </w:tcPr>
@@ -12667,7 +12401,7 @@
         </w:tc>
         <w:tc>
           <w:tcPr>
-            <w:tcW w:w="805" w:type="dxa"/>
+            <w:tcW w:w="804" w:type="dxa"/>
             <w:tcBorders/>
             <w:vAlign w:val="center"/>
           </w:tcPr>
@@ -12725,7 +12459,7 @@
         </w:tc>
         <w:tc>
           <w:tcPr>
-            <w:tcW w:w="544" w:type="dxa"/>
+            <w:tcW w:w="545" w:type="dxa"/>
             <w:tcBorders/>
             <w:vAlign w:val="center"/>
           </w:tcPr>
@@ -12754,7 +12488,7 @@
         </w:tc>
         <w:tc>
           <w:tcPr>
-            <w:tcW w:w="2613" w:type="dxa"/>
+            <w:tcW w:w="2612" w:type="dxa"/>
             <w:tcBorders/>
             <w:vAlign w:val="center"/>
           </w:tcPr>
@@ -12783,7 +12517,7 @@
         </w:tc>
         <w:tc>
           <w:tcPr>
-            <w:tcW w:w="1608" w:type="dxa"/>
+            <w:tcW w:w="1607" w:type="dxa"/>
             <w:tcBorders/>
           </w:tcPr>
           <w:p>
@@ -12843,7 +12577,7 @@
         </w:tc>
         <w:tc>
           <w:tcPr>
-            <w:tcW w:w="1801" w:type="dxa"/>
+            <w:tcW w:w="1800" w:type="dxa"/>
             <w:tcBorders/>
             <w:vAlign w:val="center"/>
           </w:tcPr>
@@ -12873,7 +12607,7 @@
         </w:tc>
         <w:tc>
           <w:tcPr>
-            <w:tcW w:w="1448" w:type="dxa"/>
+            <w:tcW w:w="1449" w:type="dxa"/>
             <w:tcBorders/>
             <w:vAlign w:val="center"/>
           </w:tcPr>
@@ -12903,7 +12637,7 @@
         </w:tc>
         <w:tc>
           <w:tcPr>
-            <w:tcW w:w="805" w:type="dxa"/>
+            <w:tcW w:w="804" w:type="dxa"/>
             <w:tcBorders/>
             <w:vAlign w:val="center"/>
           </w:tcPr>
@@ -12963,7 +12697,7 @@
         </w:tc>
         <w:tc>
           <w:tcPr>
-            <w:tcW w:w="544" w:type="dxa"/>
+            <w:tcW w:w="545" w:type="dxa"/>
             <w:tcBorders/>
             <w:vAlign w:val="center"/>
           </w:tcPr>
@@ -12993,7 +12727,7 @@
         </w:tc>
         <w:tc>
           <w:tcPr>
-            <w:tcW w:w="2613" w:type="dxa"/>
+            <w:tcW w:w="2612" w:type="dxa"/>
             <w:tcBorders/>
             <w:vAlign w:val="center"/>
           </w:tcPr>
@@ -13023,7 +12757,7 @@
         </w:tc>
         <w:tc>
           <w:tcPr>
-            <w:tcW w:w="1608" w:type="dxa"/>
+            <w:tcW w:w="1607" w:type="dxa"/>
             <w:tcBorders/>
           </w:tcPr>
           <w:p>
@@ -13077,7 +12811,9 @@
         </w:rPr>
       </w:pPr>
       <w:r>
-        <w:rPr/>
+        <w:rPr>
+          <w:lang w:val="sr-Latn-RS"/>
+        </w:rPr>
       </w:r>
     </w:p>
     <w:p>
@@ -13091,13 +12827,7 @@
         <w:rPr>
           <w:lang w:val="sr-Latn-RS"/>
         </w:rPr>
-        <w:t xml:space="preserve">Izlaz </w:t>
-      </w:r>
-      <w:r>
-        <w:rPr>
-          <w:lang w:val="sr-Latn-RS"/>
-        </w:rPr>
-        <w:t>RELAY_CTRL</w:t>
+        <w:t>Izlaz RELAY_CTRL</w:t>
       </w:r>
       <w:r>
         <w:rPr>
@@ -13159,7 +12889,7 @@
           <w:lang w:val="sr-Latn-RS"/>
         </w:rPr>
         <w:drawing>
-          <wp:anchor behindDoc="0" distT="0" distB="0" distL="0" distR="0" simplePos="0" locked="0" layoutInCell="0" allowOverlap="1" relativeHeight="74">
+          <wp:anchor behindDoc="0" distT="0" distB="0" distL="0" distR="0" simplePos="0" locked="0" layoutInCell="0" allowOverlap="1" relativeHeight="65">
             <wp:simplePos x="0" y="0"/>
             <wp:positionH relativeFrom="column">
               <wp:align>center</wp:align>
@@ -13398,11 +13128,7 @@
       <w:r>
         <w:rPr/>
         <w:br/>
-        <w:t>Slika 3.8</w:t>
-      </w:r>
-      <w:r>
-        <w:rPr/>
-        <w:t>c  Glavni SDC releji</w:t>
+        <w:t>Slika 3.8c  Glavni SDC releji</w:t>
       </w:r>
     </w:p>
     <w:p>
@@ -14261,9 +13987,8 @@
       </w:pPr>
       <w:r>
         <w:rPr>
-          <w:i/>
-          <w:iCs/>
-          <w:lang w:val="sr-Latn-RS"/>
+          <w:i w:val="false"/>
+          <w:iCs w:val="false"/>
         </w:rPr>
       </w:r>
     </w:p>
@@ -16760,7 +16485,7 @@
     </w:pPr>
     <w:r>
       <w:drawing>
-        <wp:anchor behindDoc="1" distT="0" distB="0" distL="0" distR="0" simplePos="0" locked="0" layoutInCell="0" allowOverlap="1" relativeHeight="49">
+        <wp:anchor behindDoc="1" distT="0" distB="0" distL="0" distR="0" simplePos="0" locked="0" layoutInCell="0" allowOverlap="1" relativeHeight="51">
           <wp:simplePos x="0" y="0"/>
           <wp:positionH relativeFrom="margin">
             <wp:posOffset>-304800</wp:posOffset>
@@ -16880,7 +16605,7 @@
       <w:rPr>
         <w:lang w:val="sr-RS"/>
       </w:rPr>
-      <w:t>22</w:t>
+      <w:t>7</w:t>
     </w:r>
     <w:r>
       <w:rPr>
@@ -17081,7 +16806,7 @@
             <wp:anchor behindDoc="1" distT="24765" distB="77470" distL="24765" distR="77470" simplePos="0" locked="0" layoutInCell="1" allowOverlap="1" relativeHeight="4" wp14:anchorId="019EBD50">
               <wp:simplePos x="0" y="0"/>
               <wp:positionH relativeFrom="column">
-                <wp:posOffset>-505460</wp:posOffset>
+                <wp:posOffset>-506095</wp:posOffset>
               </wp:positionH>
               <wp:positionV relativeFrom="paragraph">
                 <wp:posOffset>-257175</wp:posOffset>
@@ -17143,7 +16868,7 @@
               <v:stroke joinstyle="miter"/>
               <v:path gradientshapeok="t" o:connecttype="rect" textboxrect="0,4320,21600,21600"/>
             </v:shapetype>
-            <v:shape id="shape_0" ID="Flowchart: Manual Input 4" path="m0,1l5,0l5,5l0,5xe" fillcolor="black" stroked="f" o:allowincell="f" style="position:absolute;margin-left:-39.8pt;margin-top:-20.3pt;width:89.2pt;height:87.15pt;mso-wrap-style:none;v-text-anchor:middle;rotation:90" wp14:anchorId="019EBD50" type="_x0000_t118">
+            <v:shape id="shape_0" ID="Flowchart: Manual Input 4" path="m0,1l5,0l5,5l0,5xe" fillcolor="black" stroked="f" o:allowincell="f" style="position:absolute;margin-left:-39.85pt;margin-top:-20.3pt;width:89.2pt;height:87.15pt;mso-wrap-style:none;v-text-anchor:middle;rotation:90" wp14:anchorId="019EBD50" type="_x0000_t118">
               <v:fill o:detectmouseclick="t" type="solid" color2="white"/>
               <v:stroke color="#3465a4" weight="19080" joinstyle="miter" endcap="flat"/>
               <v:shadow on="t" obscured="f" color="black"/>
@@ -17169,7 +16894,7 @@
       <mc:AlternateContent>
         <mc:Choice Requires="wps">
           <w:drawing>
-            <wp:anchor behindDoc="1" distT="13335" distB="89535" distL="52070" distR="50800" simplePos="0" locked="0" layoutInCell="0" allowOverlap="1" relativeHeight="27" wp14:anchorId="186A84D5">
+            <wp:anchor behindDoc="1" distT="13335" distB="89535" distL="52070" distR="50800" simplePos="0" locked="0" layoutInCell="0" allowOverlap="1" relativeHeight="28" wp14:anchorId="186A84D5">
               <wp:simplePos x="0" y="0"/>
               <wp:positionH relativeFrom="margin">
                 <wp:align>center</wp:align>

</xml_diff>